<commit_message>
Expand chapters 14-16 to full academic depth
Ch14 Discrete Choice: 2,272 → 2,331 words (expanded intro, RUT foundations, IIA)
Ch15 Bayesian Methods: 1,859 → 3,760 words (full MCMC derivation, hierarchical models, BYM spatial, CEA, NMA, VOI)
Ch16 Machine Learning: 1,288 → 2,802 words (full LASSO/Ridge/ElasticNet, causal forests with honest estimation, DML framework, Obermeyer fairness)

Remaining chapters 17-30 still at outline depth — expand via batch pipeline or future sessions.
</commit_message>
<xml_diff>
--- a/textbook/docx/chapter_14_discrete_choice.docx
+++ b/textbook/docx/chapter_14_discrete_choice.docx
@@ -112,7 +112,20 @@
           <w:szCs w:val="24"/>
           <w:rFonts w:ascii="Arial" w:cs="Arial" w:eastAsia="Arial" w:hAnsi="Arial"/>
         </w:rPr>
-        <w:t xml:space="preserve">Health economics is rich in discrete choice applications. Patients choose among hospitals for elective procedures. Employees choose among employer-offered insurance plans. Physicians choose specialties and practice locations. Policymakers design insurance exchanges where consumers choose among standardized plan tiers. In each setting, understanding the factors that drive choice — and the welfare consequences of alternative choice environments — requires the discrete choice toolkit developed in this chapter.</w:t>
+        <w:t xml:space="preserve">Health economics is rich in discrete choice applications because healthcare markets are defined by choices among differentiated alternatives. Patients choose among hospitals for elective procedures, weighing quality, distance, physician recommendations, and insurance network status. Employees choose among employer-offered insurance plans, trading off premiums, deductibles, provider networks, and brand familiarity. Physicians choose specialties and practice locations, balancing income prospects, lifestyle preferences, intellectual interest, and geographic amenity. Policymakers design insurance exchanges where consumers choose among standardized plan tiers. In each setting, understanding the factors that drive choice — and the welfare consequences of alternative choice environments — requires the discrete choice toolkit.</w:t>
+      </w:r>
+    </w:p>
+    <w:p>
+      <w:pPr>
+        <w:spacing w:after="120"/>
+      </w:pPr>
+      <w:r>
+        <w:rPr>
+          <w:sz w:val="24"/>
+          <w:szCs w:val="24"/>
+          <w:rFonts w:ascii="Arial" w:cs="Arial" w:eastAsia="Arial" w:hAnsi="Arial"/>
+        </w:rPr>
+        <w:t xml:space="preserve">The progression from simple multinomial logit through nested logit, mixed logit, and structural demand estimation reflects increasing sophistication in modeling substitution patterns, taste heterogeneity, and endogenous pricing. This chapter develops each model from its theoretical foundations, derives the estimating equations, discusses implementation challenges, and illustrates the methods with landmark health economics applications. The Julia implementations are provided in Chapter 21.</w:t>
       </w:r>
     </w:p>
     <w:p>
@@ -128,7 +141,7 @@
           <w:szCs w:val="30"/>
           <w:rFonts w:ascii="Arial" w:cs="Arial" w:eastAsia="Arial" w:hAnsi="Arial"/>
         </w:rPr>
-        <w:t xml:space="preserve">Random Utility Theory</w:t>
+        <w:t xml:space="preserve">Random Utility Theory Foundations</w:t>
       </w:r>
     </w:p>
     <w:p>

</xml_diff>